<commit_message>
Add custom event registration fields
</commit_message>
<xml_diff>
--- a/Implementation plan/CF Events Platform - PRD (Luma Replacement).md.docx
+++ b/Implementation plan/CF Events Platform - PRD (Luma Replacement).md.docx
@@ -21,78 +21,15 @@
         <w:rPr/>
       </w:pPr>
       <w:r>
-        <w:rPr>
-          <w:b w:val="1"/>
-          <w:bCs w:val="1"/>
-          <w:rtl w:val="0"/>
-        </w:rPr>
-        <w:t xml:space="preserve">Project Code:</w:t>
-      </w:r>
-      <w:r>
-        <w:rPr>
-          <w:rtl w:val="0"/>
-        </w:rPr>
-        <w:t xml:space="preserve"> Sinia-Events</w:t>
-        <w:br w:type="textWrapping"/>
-      </w:r>
-      <w:r>
-        <w:rPr>
-          <w:b w:val="1"/>
-          <w:bCs w:val="1"/>
-          <w:rtl w:val="0"/>
-        </w:rPr>
-        <w:t xml:space="preserve">Version:</w:t>
-      </w:r>
-      <w:r>
-        <w:rPr>
-          <w:rtl w:val="0"/>
-        </w:rPr>
-        <w:t xml:space="preserve"> 1.0</w:t>
-        <w:br w:type="textWrapping"/>
-      </w:r>
-      <w:r>
-        <w:rPr>
-          <w:b w:val="1"/>
-          <w:bCs w:val="1"/>
-          <w:rtl w:val="0"/>
-        </w:rPr>
-        <w:t xml:space="preserve">Date:</w:t>
-      </w:r>
-      <w:r>
-        <w:rPr>
-          <w:rtl w:val="0"/>
-        </w:rPr>
-        <w:t xml:space="preserve"> February 20, 2026</w:t>
-        <w:br w:type="textWrapping"/>
-      </w:r>
-      <w:r>
-        <w:rPr>
-          <w:b w:val="1"/>
-          <w:bCs w:val="1"/>
-          <w:rtl w:val="0"/>
-        </w:rPr>
-        <w:t xml:space="preserve">Owner:</w:t>
-      </w:r>
-      <w:r>
-        <w:rPr>
-          <w:rtl w:val="0"/>
-        </w:rPr>
-        <w:t xml:space="preserve"> Mahawa Sandy</w:t>
-        <w:br w:type="textWrapping"/>
-      </w:r>
-      <w:r>
-        <w:rPr>
-          <w:b w:val="1"/>
-          <w:bCs w:val="1"/>
-          <w:rtl w:val="0"/>
-        </w:rPr>
-        <w:t xml:space="preserve">Status:</w:t>
-      </w:r>
-      <w:r>
-        <w:rPr>
-          <w:rtl w:val="0"/>
-        </w:rPr>
-        <w:t xml:space="preserve"> Planning</w:t>
+        <w:t>Project Code: Sinia-Events</w:t>
+        <w:br/>
+        <w:t>Version: 1.1</w:t>
+        <w:br/>
+        <w:t>Date: July 21, 2026</w:t>
+        <w:br/>
+        <w:t>Owner: Mahawa Sandy</w:t>
+        <w:br/>
+        <w:t>Status: Active Build</w:t>
       </w:r>
     </w:p>
     <w:p>
@@ -5417,18 +5354,7 @@
         <w:ind w:left="720" w:hanging="360"/>
       </w:pPr>
       <w:r>
-        <w:rPr>
-          <w:b w:val="1"/>
-          <w:bCs w:val="1"/>
-          <w:rtl w:val="0"/>
-        </w:rPr>
-        <w:t xml:space="preserve">Payments (future):</w:t>
-      </w:r>
-      <w:r>
-        <w:rPr>
-          <w:rtl w:val="0"/>
-        </w:rPr>
-        <w:t xml:space="preserve"> Stripe or Paystack (for paid events)</w:t>
+        <w:t>Payments (future): Monime for paid event ticketing</w:t>
       </w:r>
     </w:p>
     <w:p>
@@ -5904,18 +5830,7 @@
         <w:ind w:left="720" w:hanging="360"/>
       </w:pPr>
       <w:r>
-        <w:rPr>
-          <w:b w:val="1"/>
-          <w:bCs w:val="1"/>
-          <w:rtl w:val="0"/>
-        </w:rPr>
-        <w:t xml:space="preserve">Stripe/Paystack</w:t>
-      </w:r>
-      <w:r>
-        <w:rPr>
-          <w:rtl w:val="0"/>
-        </w:rPr>
-        <w:t xml:space="preserve"> - Paid event ticketing</w:t>
+        <w:t>Monime - Paid event ticketing, payment confirmation, refunds, and reconciliation</w:t>
       </w:r>
     </w:p>
     <w:p>
@@ -6631,18 +6546,7 @@
         <w:ind w:left="720" w:hanging="360"/>
       </w:pPr>
       <w:r>
-        <w:rPr>
-          <w:b w:val="1"/>
-          <w:bCs w:val="1"/>
-          <w:rtl w:val="0"/>
-        </w:rPr>
-        <w:t xml:space="preserve">Free:</w:t>
-      </w:r>
-      <w:r>
-        <w:rPr>
-          <w:rtl w:val="0"/>
-        </w:rPr>
-        <w:t xml:space="preserve"> Self-hosted (open source)</w:t>
+        <w:t>Free: Hosted core event workflow plus self-hosted open-source option; basic custom fields, tickets, check-in, and CSV reporting</w:t>
       </w:r>
     </w:p>
     <w:p>
@@ -6654,18 +6558,7 @@
         <w:ind w:left="720" w:hanging="360"/>
       </w:pPr>
       <w:r>
-        <w:rPr>
-          <w:b w:val="1"/>
-          <w:bCs w:val="1"/>
-          <w:rtl w:val="0"/>
-        </w:rPr>
-        <w:t xml:space="preserve">Paid (SaaS):</w:t>
-      </w:r>
-      <w:r>
-        <w:rPr>
-          <w:rtl w:val="0"/>
-        </w:rPr>
-        <w:t xml:space="preserve"> Hosted version with custom domains, priority support, extra features ($20-50/month per org)</w:t>
+        <w:t>Paid: Radius Pro for advanced analytics, reporting, messaging, form logic, branding, certificates, recurring events, more organizer seats, and priority support; transaction fees for paid tickets</w:t>
       </w:r>
     </w:p>
     <w:p>
@@ -8558,6 +8451,207 @@
     </w:p>
     <w:p>
       <w:pPr>
+        <w:pStyle w:val="Heading2"/>
+      </w:pPr>
+      <w:r>
+        <w:t>13. Product &amp; Business Model Addendum</w:t>
+      </w:r>
+    </w:p>
+    <w:p>
+      <w:pPr>
+        <w:pStyle w:val="Heading3"/>
+      </w:pPr>
+      <w:r>
+        <w:t>Concept note decision</w:t>
+      </w:r>
+    </w:p>
+    <w:p>
+      <w:r>
+        <w:t>Radius is an event discovery and operations platform for Sierra Leone. Its advantage over Google Forms is the connected event lifecycle: discovery, branded pages, flexible registration, confirmation, tickets, QR check-in, collaboration, attendee management, organization pages, analytics, and reporting.</w:t>
+      </w:r>
+    </w:p>
+    <w:p>
+      <w:pPr>
+        <w:pStyle w:val="Heading3"/>
+      </w:pPr>
+      <w:r>
+        <w:t>Freemium model</w:t>
+      </w:r>
+    </w:p>
+    <w:p>
+      <w:pPr>
+        <w:numPr>
+          <w:ilvl w:val="0"/>
+          <w:numId w:val="21"/>
+        </w:numPr>
+      </w:pPr>
+      <w:r>
+        <w:t>Free: public events, basic custom registration fields, attendee management, tickets, QR check-in, basic counts, CSV export, and standard Radius branding.</w:t>
+      </w:r>
+    </w:p>
+    <w:p>
+      <w:pPr>
+        <w:numPr>
+          <w:ilvl w:val="0"/>
+          <w:numId w:val="21"/>
+        </w:numPr>
+      </w:pPr>
+      <w:r>
+        <w:t>Radius Pro: advanced and organization-wide analytics, scheduled reports, more organizer seats, scheduled email/SMS/WhatsApp reminders, advanced form logic, file uploads, custom branding and domains, certificates, recurring events, promotion, and priority support.</w:t>
+      </w:r>
+    </w:p>
+    <w:p>
+      <w:pPr>
+        <w:numPr>
+          <w:ilvl w:val="0"/>
+          <w:numId w:val="21"/>
+        </w:numPr>
+      </w:pPr>
+      <w:r>
+        <w:t>Usage and transaction revenue: service fees on paid tickets, paid communication credits, and optional featured-event promotion.</w:t>
+      </w:r>
+    </w:p>
+    <w:p>
+      <w:pPr>
+        <w:pStyle w:val="Heading3"/>
+      </w:pPr>
+      <w:r>
+        <w:t>Payment provider decision</w:t>
+      </w:r>
+    </w:p>
+    <w:p>
+      <w:r>
+        <w:t>Monime is the planned payment provider. Integration will use the product owner's existing Monime account and space after the free workflow is stable and API access, payment methods, settlement, fees, refunds, reconciliation, and signed webhook requirements are confirmed.</w:t>
+      </w:r>
+    </w:p>
+    <w:p>
+      <w:pPr>
+        <w:pStyle w:val="Heading3"/>
+      </w:pPr>
+      <w:r>
+        <w:t>PRD requirements</w:t>
+      </w:r>
+    </w:p>
+    <w:p>
+      <w:pPr>
+        <w:numPr>
+          <w:ilvl w:val="0"/>
+          <w:numId w:val="21"/>
+        </w:numPr>
+      </w:pPr>
+      <w:r>
+        <w:t>Event creators can add up to 25 custom questions: short answer, long answer, phone, number, dropdown, single choice, yes/no checkbox, and multiple choice.</w:t>
+      </w:r>
+    </w:p>
+    <w:p>
+      <w:pPr>
+        <w:numPr>
+          <w:ilvl w:val="0"/>
+          <w:numId w:val="21"/>
+        </w:numPr>
+      </w:pPr>
+      <w:r>
+        <w:t>Questions support labels, optional help text, required status, options, and ordering. Answers are server-validated, visible to authorized event managers, and included in event CSV exports.</w:t>
+      </w:r>
+    </w:p>
+    <w:p>
+      <w:pPr>
+        <w:numPr>
+          <w:ilvl w:val="0"/>
+          <w:numId w:val="21"/>
+        </w:numPr>
+      </w:pPr>
+      <w:r>
+        <w:t>Basic custom questions remain free during beta. Conditional logic, file uploads, templates, and workflow automation may become Radius Pro features.</w:t>
+      </w:r>
+    </w:p>
+    <w:p>
+      <w:pPr>
+        <w:numPr>
+          <w:ilvl w:val="0"/>
+          <w:numId w:val="21"/>
+        </w:numPr>
+      </w:pPr>
+      <w:r>
+        <w:t>Registration always returns an immediate on-screen ticket. Confirmation email is attempted but cannot invalidate a successful registration if delivery fails.</w:t>
+      </w:r>
+    </w:p>
+    <w:p>
+      <w:pPr>
+        <w:numPr>
+          <w:ilvl w:val="0"/>
+          <w:numId w:val="21"/>
+        </w:numPr>
+      </w:pPr>
+      <w:r>
+        <w:t>Future location discovery uses structured venue, city, country, and coordinates, with autocomplete, a movable map pin, city filters, and later opt-in Near Me sorting.</w:t>
+      </w:r>
+    </w:p>
+    <w:p>
+      <w:pPr>
+        <w:pStyle w:val="Heading3"/>
+      </w:pPr>
+      <w:r>
+        <w:t>Implementation sequence</w:t>
+      </w:r>
+    </w:p>
+    <w:p>
+      <w:pPr>
+        <w:numPr>
+          <w:ilvl w:val="0"/>
+          <w:numId w:val="22"/>
+        </w:numPr>
+      </w:pPr>
+      <w:r>
+        <w:t>Phase 1: custom registration fields, public answers, organizer review, and CSV export.</w:t>
+      </w:r>
+    </w:p>
+    <w:p>
+      <w:pPr>
+        <w:numPr>
+          <w:ilvl w:val="0"/>
+          <w:numId w:val="22"/>
+        </w:numPr>
+      </w:pPr>
+      <w:r>
+        <w:t>Phase 2: verified-domain email delivery and communication templates.</w:t>
+      </w:r>
+    </w:p>
+    <w:p>
+      <w:pPr>
+        <w:numPr>
+          <w:ilvl w:val="0"/>
+          <w:numId w:val="22"/>
+        </w:numPr>
+      </w:pPr>
+      <w:r>
+        <w:t>Phase 3: structured locations, venue autocomplete, city filters, and Near Me discovery.</w:t>
+      </w:r>
+    </w:p>
+    <w:p>
+      <w:pPr>
+        <w:numPr>
+          <w:ilvl w:val="0"/>
+          <w:numId w:val="22"/>
+        </w:numPr>
+      </w:pPr>
+      <w:r>
+        <w:t>Phase 4: Radius Pro entitlements, advanced analytics, reporting, messaging, branding, and certificates.</w:t>
+      </w:r>
+    </w:p>
+    <w:p>
+      <w:pPr>
+        <w:numPr>
+          <w:ilvl w:val="0"/>
+          <w:numId w:val="22"/>
+        </w:numPr>
+      </w:pPr>
+      <w:r>
+        <w:t>Phase 5: Monime paid ticketing, idempotent webhooks, payment records, refunds, settlement, and reconciliation.</w:t>
+      </w:r>
+    </w:p>
+    <w:p>
+      <w:pPr>
         <w:rPr/>
       </w:pPr>
       <w:r>
@@ -13014,6 +13108,40 @@
   </w:num>
   <w:num w:numId="20">
     <w:abstractNumId w:val="20"/>
+  </w:num>
+  <w:abstractNum w:abstractNumId="21">
+    <w:lvl w:ilvl="0">
+      <w:start w:val="1"/>
+      <w:numFmt w:val="bullet"/>
+      <w:lvlText w:val="•"/>
+      <w:suff w:val="tab"/>
+      <w:pPr>
+        <w:tabs>
+          <w:tab w:val="num" w:pos="720"/>
+        </w:tabs>
+        <w:ind w:left="720" w:hanging="360"/>
+      </w:pPr>
+    </w:lvl>
+  </w:abstractNum>
+  <w:num w:numId="21">
+    <w:abstractNumId w:val="21"/>
+  </w:num>
+  <w:abstractNum w:abstractNumId="22">
+    <w:lvl w:ilvl="0">
+      <w:start w:val="1"/>
+      <w:numFmt w:val="decimal"/>
+      <w:lvlText w:val="%1."/>
+      <w:suff w:val="tab"/>
+      <w:pPr>
+        <w:tabs>
+          <w:tab w:val="num" w:pos="720"/>
+        </w:tabs>
+        <w:ind w:left="720" w:hanging="360"/>
+      </w:pPr>
+    </w:lvl>
+  </w:abstractNum>
+  <w:num w:numId="22">
+    <w:abstractNumId w:val="22"/>
   </w:num>
 </w:numbering>
 </file>

</xml_diff>